<commit_message>
Leaflet Zone B: the package leaflet to an EMA leaflet ePI Bundle (WIP: code, fixtures, tests)
Co-Authored-By: Claude Opus 5.5 <noreply@anthropic.com>
</commit_message>
<xml_diff>
--- a/test/fixtures/certified-word/recompute/pl.docx
+++ b/test/fixtures/certified-word/recompute/pl.docx
@@ -19,7 +19,7 @@
     </w:p>
     <w:p>
       <w:r>
-        <w:t xml:space="preserve">1. What Exampline is and what it is used for</w:t>
+        <w:t xml:space="preserve">1. What Synthetic Exampline is and what it is used for</w:t>
       </w:r>
     </w:p>
     <w:p>
@@ -29,7 +29,7 @@
     </w:p>
     <w:p>
       <w:r>
-        <w:t xml:space="preserve">2. What you need to know before you take use Exampline</w:t>
+        <w:t xml:space="preserve">2. What you need to know before you take use Synthetic Exampline</w:t>
       </w:r>
     </w:p>
     <w:p>
@@ -39,7 +39,7 @@
     </w:p>
     <w:p>
       <w:r>
-        <w:t xml:space="preserve">Do not take use Exampline</w:t>
+        <w:t xml:space="preserve">Do not take use Synthetic Exampline</w:t>
       </w:r>
     </w:p>
     <w:p>
@@ -59,7 +59,7 @@
     </w:p>
     <w:p>
       <w:r>
-        <w:t xml:space="preserve">Other medicines and Exampline</w:t>
+        <w:t xml:space="preserve">Other medicines and Synthetic Exampline</w:t>
       </w:r>
     </w:p>
     <w:p>
@@ -89,7 +89,7 @@
     </w:p>
     <w:p>
       <w:r>
-        <w:t xml:space="preserve">3. How to take use Exampline</w:t>
+        <w:t xml:space="preserve">3. How to take use Synthetic Exampline</w:t>
       </w:r>
     </w:p>
     <w:p>
@@ -119,7 +119,7 @@
     </w:p>
     <w:p>
       <w:r>
-        <w:t xml:space="preserve">5. How to store Exampline</w:t>
+        <w:t xml:space="preserve">5. How to store Synthetic Exampline</w:t>
       </w:r>
     </w:p>
     <w:p>
@@ -139,7 +139,7 @@
     </w:p>
     <w:p>
       <w:r>
-        <w:t xml:space="preserve">What Exampline contains</w:t>
+        <w:t xml:space="preserve">What Synthetic Exampline contains</w:t>
       </w:r>
     </w:p>
     <w:p>
@@ -149,7 +149,7 @@
     </w:p>
     <w:p>
       <w:r>
-        <w:t xml:space="preserve">What Exampline looks like and contents of the pack</w:t>
+        <w:t xml:space="preserve">What Synthetic Exampline looks like and contents of the pack</w:t>
       </w:r>
     </w:p>
     <w:p>
@@ -160,6 +160,16 @@
     <w:p>
       <w:r>
         <w:t xml:space="preserve">Marketing Authorisation Holder and Manufacturer</w:t>
+      </w:r>
+    </w:p>
+    <w:p>
+      <w:r>
+        <w:t xml:space="preserve">Synthetic Holder B.V.</w:t>
+      </w:r>
+    </w:p>
+    <w:p>
+      <w:r>
+        <w:t xml:space="preserve">1 Example Street</w:t>
       </w:r>
     </w:p>
     <w:p>

</xml_diff>